<commit_message>
fix(docx): preserve reading order when body text interrupts a list
Signed-off-by: Cesar Berrospi Ramis <ceb@zurich.ibm.com>
</commit_message>
<xml_diff>
--- a/tests/data/docx/sources/docx_lists.docx
+++ b/tests/data/docx/sources/docx_lists.docx
@@ -1,6 +1,6 @@
 
 <file path=word/document.xml><?xml version="1.0" encoding="utf-8"?>
-<w:document xmlns:wpc="http://schemas.microsoft.com/office/word/2010/wordprocessingCanvas" xmlns:cx="http://schemas.microsoft.com/office/drawing/2014/chartex" xmlns:cx1="http://schemas.microsoft.com/office/drawing/2015/9/8/chartex" xmlns:cx2="http://schemas.microsoft.com/office/drawing/2015/10/21/chartex" xmlns:cx3="http://schemas.microsoft.com/office/drawing/2016/5/9/chartex" xmlns:cx4="http://schemas.microsoft.com/office/drawing/2016/5/10/chartex" xmlns:cx5="http://schemas.microsoft.com/office/drawing/2016/5/11/chartex" xmlns:cx6="http://schemas.microsoft.com/office/drawing/2016/5/12/chartex" xmlns:cx7="http://schemas.microsoft.com/office/drawing/2016/5/13/chartex" xmlns:cx8="http://schemas.microsoft.com/office/drawing/2016/5/14/chartex" xmlns:mc="http://schemas.openxmlformats.org/markup-compatibility/2006" xmlns:aink="http://schemas.microsoft.com/office/drawing/2016/ink" xmlns:am3d="http://schemas.microsoft.com/office/drawing/2017/model3d" xmlns:o="urn:schemas-microsoft-com:office:office" xmlns:oel="http://schemas.microsoft.com/office/2019/extlst" xmlns:r="http://schemas.openxmlformats.org/officeDocument/2006/relationships" xmlns:m="http://schemas.openxmlformats.org/officeDocument/2006/math" xmlns:v="urn:schemas-microsoft-com:vml" xmlns:wp14="http://schemas.microsoft.com/office/word/2010/wordprocessingDrawing" xmlns:wp="http://schemas.openxmlformats.org/drawingml/2006/wordprocessingDrawing" xmlns:w10="urn:schemas-microsoft-com:office:word" xmlns:w="http://schemas.openxmlformats.org/wordprocessingml/2006/main" xmlns:w14="http://schemas.microsoft.com/office/word/2010/wordml" xmlns:w15="http://schemas.microsoft.com/office/word/2012/wordml" xmlns:w16cex="http://schemas.microsoft.com/office/word/2018/wordml/cex" xmlns:w16cid="http://schemas.microsoft.com/office/word/2016/wordml/cid" xmlns:w16="http://schemas.microsoft.com/office/word/2018/wordml" xmlns:w16du="http://schemas.microsoft.com/office/word/2023/wordml/word16du" xmlns:w16sdtdh="http://schemas.microsoft.com/office/word/2020/wordml/sdtdatahash" xmlns:w16sdtfl="http://schemas.microsoft.com/office/word/2024/wordml/sdtformatlock" xmlns:w16se="http://schemas.microsoft.com/office/word/2015/wordml/symex" xmlns:wpg="http://schemas.microsoft.com/office/word/2010/wordprocessingGroup" xmlns:wpi="http://schemas.microsoft.com/office/word/2010/wordprocessingInk" xmlns:wne="http://schemas.microsoft.com/office/word/2006/wordml" xmlns:wps="http://schemas.microsoft.com/office/word/2010/wordprocessingShape" mc:Ignorable="w14 w15 w16se w16cid w16 w16cex w16sdtdh w16sdtfl w16du wp14">
+<w:document xmlns:wpc="http://schemas.microsoft.com/office/word/2010/wordprocessingCanvas" xmlns:cx="http://schemas.microsoft.com/office/drawing/2014/chartex" xmlns:cx1="http://schemas.microsoft.com/office/drawing/2015/9/8/chartex" xmlns:cx2="http://schemas.microsoft.com/office/drawing/2015/10/21/chartex" xmlns:cx3="http://schemas.microsoft.com/office/drawing/2016/5/9/chartex" xmlns:cx4="http://schemas.microsoft.com/office/drawing/2016/5/10/chartex" xmlns:cx5="http://schemas.microsoft.com/office/drawing/2016/5/11/chartex" xmlns:cx6="http://schemas.microsoft.com/office/drawing/2016/5/12/chartex" xmlns:cx7="http://schemas.microsoft.com/office/drawing/2016/5/13/chartex" xmlns:cx8="http://schemas.microsoft.com/office/drawing/2016/5/14/chartex" xmlns:mc="http://schemas.openxmlformats.org/markup-compatibility/2006" xmlns:m="http://schemas.openxmlformats.org/officeDocument/2006/math" xmlns:aink="http://schemas.microsoft.com/office/drawing/2016/ink" xmlns:am3d="http://schemas.microsoft.com/office/drawing/2017/model3d" xmlns:oel="http://schemas.microsoft.com/office/2019/extlst" xmlns:r="http://schemas.openxmlformats.org/officeDocument/2006/relationships" xmlns:wp14="http://schemas.microsoft.com/office/word/2010/wordprocessingDrawing" xmlns:wp="http://schemas.openxmlformats.org/drawingml/2006/wordprocessingDrawing" xmlns:wpg="http://schemas.microsoft.com/office/word/2010/wordprocessingGroup" xmlns:wpi="http://schemas.microsoft.com/office/word/2010/wordprocessingInk" xmlns:wps="http://schemas.microsoft.com/office/word/2010/wordprocessingShape" xmlns:o="urn:schemas-microsoft-com:office:office" xmlns:v="urn:schemas-microsoft-com:vml" xmlns:w10="urn:schemas-microsoft-com:office:word" xmlns:w="http://schemas.openxmlformats.org/wordprocessingml/2006/main" xmlns:w14="http://schemas.microsoft.com/office/word/2010/wordml" xmlns:w15="http://schemas.microsoft.com/office/word/2012/wordml" xmlns:w16cex="http://schemas.microsoft.com/office/word/2018/wordml/cex" xmlns:w16cid="http://schemas.microsoft.com/office/word/2016/wordml/cid" xmlns:w16="http://schemas.microsoft.com/office/word/2018/wordml" xmlns:w16sdtdh="http://schemas.microsoft.com/office/word/2020/wordml/sdtdatahash" xmlns:w16sdtfl="http://schemas.microsoft.com/office/word/2024/wordml/sdtformatlock" xmlns:w16se="http://schemas.microsoft.com/office/word/2015/wordml/symex" xmlns:w16du="http://schemas.microsoft.com/office/word/2023/wordml/word16du" xmlns:wne="http://schemas.microsoft.com/office/word/2006/wordml" mc:Ignorable="w14 w15 w16se w16cid w16 w16cex w16sdtdh w16sdtfl w16du wp14">
   <w:body>
     <w:p>
       <w:pPr>
@@ -650,6 +650,9 @@
       <w:pPr>
         <w:pStyle w:val="Heading3"/>
       </w:pPr>
+      <w:r>
+        <w:t xml:space="preserve">Test 8: </w:t>
+      </w:r>
       <w:r>
         <w:t>Style-based lists</w:t>
       </w:r>
@@ -834,6 +837,218 @@
           <w:color w:val="0070C0"/>
         </w:rPr>
         <w:t>Fourth item</w:t>
+      </w:r>
+    </w:p>
+    <w:p>
+      <w:r>
+        <w:br w:type="page"/>
+      </w:r>
+    </w:p>
+    <w:p>
+      <w:pPr>
+        <w:pStyle w:val="Heading3"/>
+      </w:pPr>
+      <w:r>
+        <w:lastRenderedPageBreak/>
+        <w:t>Test 9: List continuity with non-empty text</w:t>
+      </w:r>
+    </w:p>
+    <w:p/>
+    <w:p>
+      <w:pPr>
+        <w:pStyle w:val="ListParagraph"/>
+        <w:numPr>
+          <w:ilvl w:val="0"/>
+          <w:numId w:val="8"/>
+        </w:numPr>
+        <w:spacing w:after="160" w:line="278" w:lineRule="auto"/>
+        <w:ind w:left="0"/>
+        <w:contextualSpacing w:val="0"/>
+      </w:pPr>
+      <w:r>
+        <w:t>ORCHARD MAP AND GARDEN NOTES</w:t>
+      </w:r>
+    </w:p>
+    <w:p>
+      <w:pPr>
+        <w:pStyle w:val="ListParagraph"/>
+        <w:numPr>
+          <w:ilvl w:val="1"/>
+          <w:numId w:val="8"/>
+        </w:numPr>
+        <w:spacing w:after="160" w:line="278" w:lineRule="auto"/>
+        <w:ind w:left="0"/>
+        <w:contextualSpacing w:val="0"/>
+      </w:pPr>
+      <w:r>
+        <w:t>Morning Walk</w:t>
+      </w:r>
+    </w:p>
+    <w:p>
+      <w:pPr>
+        <w:pStyle w:val="BodyText"/>
+      </w:pPr>
+      <w:r>
+        <w:t>The gravel path bent around a quiet pond where ducks drifted in slow circles.</w:t>
+      </w:r>
+    </w:p>
+    <w:p>
+      <w:pPr>
+        <w:pStyle w:val="BodyText"/>
+      </w:pPr>
+      <w:r>
+        <w:t>A wooden bench near the willow still held last week's newspaper under a stone.</w:t>
+      </w:r>
+    </w:p>
+    <w:p>
+      <w:pPr>
+        <w:pStyle w:val="ListParagraph"/>
+        <w:numPr>
+          <w:ilvl w:val="1"/>
+          <w:numId w:val="8"/>
+        </w:numPr>
+        <w:spacing w:after="160" w:line="278" w:lineRule="auto"/>
+        <w:ind w:left="0"/>
+        <w:contextualSpacing w:val="0"/>
+      </w:pPr>
+      <w:r>
+        <w:t>Greenhouse Shelves</w:t>
+      </w:r>
+    </w:p>
+    <w:p>
+      <w:pPr>
+        <w:pStyle w:val="BodyText"/>
+      </w:pPr>
+      <w:r>
+        <w:t>Tomato seedlings leaned toward the glass as afternoon light warmed the trays.</w:t>
+      </w:r>
+    </w:p>
+    <w:p>
+      <w:pPr>
+        <w:pStyle w:val="ListParagraph"/>
+        <w:numPr>
+          <w:ilvl w:val="0"/>
+          <w:numId w:val="8"/>
+        </w:numPr>
+        <w:spacing w:after="160" w:line="278" w:lineRule="auto"/>
+        <w:ind w:left="0"/>
+        <w:contextualSpacing w:val="0"/>
+      </w:pPr>
+      <w:r>
+        <w:t>WEEKEND ERRAND LIST</w:t>
+      </w:r>
+    </w:p>
+    <w:p>
+      <w:pPr>
+        <w:pStyle w:val="ListParagraph"/>
+        <w:numPr>
+          <w:ilvl w:val="1"/>
+          <w:numId w:val="8"/>
+        </w:numPr>
+        <w:spacing w:after="160" w:line="278" w:lineRule="auto"/>
+        <w:ind w:left="0"/>
+        <w:contextualSpacing w:val="0"/>
+      </w:pPr>
+      <w:r>
+        <w:t>Market Stops</w:t>
+      </w:r>
+    </w:p>
+    <w:p>
+      <w:pPr>
+        <w:pStyle w:val="ListParagraph"/>
+        <w:numPr>
+          <w:ilvl w:val="2"/>
+          <w:numId w:val="8"/>
+        </w:numPr>
+        <w:spacing w:after="160" w:line="278" w:lineRule="auto"/>
+        <w:ind w:left="0"/>
+        <w:contextualSpacing w:val="0"/>
+      </w:pPr>
+      <w:r>
+        <w:t>Buy fresh bread from the corner bakery</w:t>
+      </w:r>
+    </w:p>
+    <w:p>
+      <w:pPr>
+        <w:pStyle w:val="ListParagraph"/>
+        <w:numPr>
+          <w:ilvl w:val="2"/>
+          <w:numId w:val="8"/>
+        </w:numPr>
+        <w:spacing w:after="160" w:line="278" w:lineRule="auto"/>
+        <w:ind w:left="0"/>
+        <w:contextualSpacing w:val="0"/>
+      </w:pPr>
+      <w:r>
+        <w:t>Pick up citrus and green onions</w:t>
+      </w:r>
+    </w:p>
+    <w:p>
+      <w:pPr>
+        <w:pStyle w:val="ListParagraph"/>
+        <w:numPr>
+          <w:ilvl w:val="2"/>
+          <w:numId w:val="8"/>
+        </w:numPr>
+        <w:spacing w:after="160" w:line="278" w:lineRule="auto"/>
+        <w:ind w:left="0"/>
+        <w:contextualSpacing w:val="0"/>
+      </w:pPr>
+      <w:r>
+        <w:t>Return the borrowed library novels</w:t>
+      </w:r>
+    </w:p>
+    <w:p>
+      <w:pPr>
+        <w:pStyle w:val="ListParagraph"/>
+        <w:numPr>
+          <w:ilvl w:val="1"/>
+          <w:numId w:val="8"/>
+        </w:numPr>
+        <w:spacing w:after="160" w:line="278" w:lineRule="auto"/>
+        <w:ind w:left="0"/>
+        <w:contextualSpacing w:val="0"/>
+      </w:pPr>
+      <w:r>
+        <w:t>Kitchen Tasks</w:t>
+      </w:r>
+    </w:p>
+    <w:p>
+      <w:pPr>
+        <w:pStyle w:val="ListParagraph"/>
+        <w:numPr>
+          <w:ilvl w:val="0"/>
+          <w:numId w:val="8"/>
+        </w:numPr>
+        <w:spacing w:after="160" w:line="278" w:lineRule="auto"/>
+        <w:ind w:left="0"/>
+        <w:contextualSpacing w:val="0"/>
+      </w:pPr>
+      <w:r>
+        <w:t>WORKSHOP AND TOOL SHED</w:t>
+      </w:r>
+    </w:p>
+    <w:p>
+      <w:pPr>
+        <w:pStyle w:val="ListParagraph"/>
+        <w:numPr>
+          <w:ilvl w:val="1"/>
+          <w:numId w:val="8"/>
+        </w:numPr>
+        <w:spacing w:after="160" w:line="278" w:lineRule="auto"/>
+        <w:ind w:left="0"/>
+        <w:contextualSpacing w:val="0"/>
+      </w:pPr>
+      <w:r>
+        <w:t>Bench Setup</w:t>
+      </w:r>
+    </w:p>
+    <w:p>
+      <w:pPr>
+        <w:pStyle w:val="BodyText"/>
+      </w:pPr>
+      <w:r>
+        <w:t>The spare clamps were sorted into labeled tins along the lower shelf.</w:t>
       </w:r>
     </w:p>
     <w:p/>
@@ -848,7 +1063,7 @@
 </file>
 
 <file path=word/numbering.xml><?xml version="1.0" encoding="utf-8"?>
-<w:numbering xmlns:wpc="http://schemas.microsoft.com/office/word/2010/wordprocessingCanvas" xmlns:cx="http://schemas.microsoft.com/office/drawing/2014/chartex" xmlns:cx1="http://schemas.microsoft.com/office/drawing/2015/9/8/chartex" xmlns:cx2="http://schemas.microsoft.com/office/drawing/2015/10/21/chartex" xmlns:cx3="http://schemas.microsoft.com/office/drawing/2016/5/9/chartex" xmlns:cx4="http://schemas.microsoft.com/office/drawing/2016/5/10/chartex" xmlns:cx5="http://schemas.microsoft.com/office/drawing/2016/5/11/chartex" xmlns:cx6="http://schemas.microsoft.com/office/drawing/2016/5/12/chartex" xmlns:cx7="http://schemas.microsoft.com/office/drawing/2016/5/13/chartex" xmlns:cx8="http://schemas.microsoft.com/office/drawing/2016/5/14/chartex" xmlns:mc="http://schemas.openxmlformats.org/markup-compatibility/2006" xmlns:aink="http://schemas.microsoft.com/office/drawing/2016/ink" xmlns:am3d="http://schemas.microsoft.com/office/drawing/2017/model3d" xmlns:o="urn:schemas-microsoft-com:office:office" xmlns:oel="http://schemas.microsoft.com/office/2019/extlst" xmlns:r="http://schemas.openxmlformats.org/officeDocument/2006/relationships" xmlns:m="http://schemas.openxmlformats.org/officeDocument/2006/math" xmlns:v="urn:schemas-microsoft-com:vml" xmlns:wp14="http://schemas.microsoft.com/office/word/2010/wordprocessingDrawing" xmlns:wp="http://schemas.openxmlformats.org/drawingml/2006/wordprocessingDrawing" xmlns:w10="urn:schemas-microsoft-com:office:word" xmlns:w="http://schemas.openxmlformats.org/wordprocessingml/2006/main" xmlns:w14="http://schemas.microsoft.com/office/word/2010/wordml" xmlns:w15="http://schemas.microsoft.com/office/word/2012/wordml" xmlns:w16cex="http://schemas.microsoft.com/office/word/2018/wordml/cex" xmlns:w16cid="http://schemas.microsoft.com/office/word/2016/wordml/cid" xmlns:w16="http://schemas.microsoft.com/office/word/2018/wordml" xmlns:w16du="http://schemas.microsoft.com/office/word/2023/wordml/word16du" xmlns:w16sdtdh="http://schemas.microsoft.com/office/word/2020/wordml/sdtdatahash" xmlns:w16sdtfl="http://schemas.microsoft.com/office/word/2024/wordml/sdtformatlock" xmlns:w16se="http://schemas.microsoft.com/office/word/2015/wordml/symex" xmlns:wpg="http://schemas.microsoft.com/office/word/2010/wordprocessingGroup" xmlns:wpi="http://schemas.microsoft.com/office/word/2010/wordprocessingInk" xmlns:wne="http://schemas.microsoft.com/office/word/2006/wordml" xmlns:wps="http://schemas.microsoft.com/office/word/2010/wordprocessingShape" mc:Ignorable="w14 w15 w16se w16cid w16 w16cex w16sdtdh w16sdtfl w16du wp14">
+<w:numbering xmlns:wpc="http://schemas.microsoft.com/office/word/2010/wordprocessingCanvas" xmlns:cx="http://schemas.microsoft.com/office/drawing/2014/chartex" xmlns:cx1="http://schemas.microsoft.com/office/drawing/2015/9/8/chartex" xmlns:cx2="http://schemas.microsoft.com/office/drawing/2015/10/21/chartex" xmlns:cx3="http://schemas.microsoft.com/office/drawing/2016/5/9/chartex" xmlns:cx4="http://schemas.microsoft.com/office/drawing/2016/5/10/chartex" xmlns:cx5="http://schemas.microsoft.com/office/drawing/2016/5/11/chartex" xmlns:cx6="http://schemas.microsoft.com/office/drawing/2016/5/12/chartex" xmlns:cx7="http://schemas.microsoft.com/office/drawing/2016/5/13/chartex" xmlns:cx8="http://schemas.microsoft.com/office/drawing/2016/5/14/chartex" xmlns:mc="http://schemas.openxmlformats.org/markup-compatibility/2006" xmlns:m="http://schemas.openxmlformats.org/officeDocument/2006/math" xmlns:aink="http://schemas.microsoft.com/office/drawing/2016/ink" xmlns:am3d="http://schemas.microsoft.com/office/drawing/2017/model3d" xmlns:oel="http://schemas.microsoft.com/office/2019/extlst" xmlns:r="http://schemas.openxmlformats.org/officeDocument/2006/relationships" xmlns:wp14="http://schemas.microsoft.com/office/word/2010/wordprocessingDrawing" xmlns:wp="http://schemas.openxmlformats.org/drawingml/2006/wordprocessingDrawing" xmlns:wpg="http://schemas.microsoft.com/office/word/2010/wordprocessingGroup" xmlns:wpi="http://schemas.microsoft.com/office/word/2010/wordprocessingInk" xmlns:wps="http://schemas.microsoft.com/office/word/2010/wordprocessingShape" xmlns:o="urn:schemas-microsoft-com:office:office" xmlns:v="urn:schemas-microsoft-com:vml" xmlns:w10="urn:schemas-microsoft-com:office:word" xmlns:w="http://schemas.openxmlformats.org/wordprocessingml/2006/main" xmlns:w14="http://schemas.microsoft.com/office/word/2010/wordml" xmlns:w15="http://schemas.microsoft.com/office/word/2012/wordml" xmlns:w16cex="http://schemas.microsoft.com/office/word/2018/wordml/cex" xmlns:w16cid="http://schemas.microsoft.com/office/word/2016/wordml/cid" xmlns:w16="http://schemas.microsoft.com/office/word/2018/wordml" xmlns:w16sdtdh="http://schemas.microsoft.com/office/word/2020/wordml/sdtdatahash" xmlns:w16sdtfl="http://schemas.microsoft.com/office/word/2024/wordml/sdtformatlock" xmlns:w16se="http://schemas.microsoft.com/office/word/2015/wordml/symex" xmlns:w16du="http://schemas.microsoft.com/office/word/2023/wordml/word16du" xmlns:wne="http://schemas.microsoft.com/office/word/2006/wordml" mc:Ignorable="w14 w15 w16se w16cid w16 w16cex w16sdtdh w16sdtfl w16du wp14">
   <w:abstractNum w:abstractNumId="0" w15:restartNumberingAfterBreak="0">
     <w:nsid w:val="07CA081B"/>
     <w:multiLevelType w:val="hybridMultilevel"/>
@@ -1483,6 +1698,59 @@
     <w:lvl w:ilvl="2">
       <w:numFmt w:val="decimal"/>
       <w:lvlText w:val=""/>
+      <w:lvlJc w:val="left"/>
+    </w:lvl>
+    <w:lvl w:ilvl="3">
+      <w:numFmt w:val="decimal"/>
+      <w:lvlText w:val=""/>
+      <w:lvlJc w:val="left"/>
+    </w:lvl>
+    <w:lvl w:ilvl="4">
+      <w:numFmt w:val="decimal"/>
+      <w:lvlText w:val=""/>
+      <w:lvlJc w:val="left"/>
+    </w:lvl>
+    <w:lvl w:ilvl="5">
+      <w:numFmt w:val="decimal"/>
+      <w:lvlText w:val=""/>
+      <w:lvlJc w:val="left"/>
+    </w:lvl>
+    <w:lvl w:ilvl="6">
+      <w:numFmt w:val="decimal"/>
+      <w:lvlText w:val=""/>
+      <w:lvlJc w:val="left"/>
+    </w:lvl>
+    <w:lvl w:ilvl="7">
+      <w:numFmt w:val="decimal"/>
+      <w:lvlText w:val=""/>
+      <w:lvlJc w:val="left"/>
+    </w:lvl>
+    <w:lvl w:ilvl="8">
+      <w:numFmt w:val="decimal"/>
+      <w:lvlText w:val=""/>
+      <w:lvlJc w:val="left"/>
+    </w:lvl>
+  </w:abstractNum>
+  <w:abstractNum w:abstractNumId="7" w15:restartNumberingAfterBreak="0">
+    <w:nsid w:val="6FB83D89"/>
+    <w:multiLevelType w:val="multilevel"/>
+    <w:tmpl w:val="F8BE5244"/>
+    <w:lvl w:ilvl="0">
+      <w:start w:val="1"/>
+      <w:numFmt w:val="decimal"/>
+      <w:lvlText w:val="%1."/>
+      <w:lvlJc w:val="left"/>
+    </w:lvl>
+    <w:lvl w:ilvl="1">
+      <w:start w:val="1"/>
+      <w:numFmt w:val="decimal"/>
+      <w:lvlText w:val="%1.%2"/>
+      <w:lvlJc w:val="left"/>
+    </w:lvl>
+    <w:lvl w:ilvl="2">
+      <w:start w:val="1"/>
+      <w:numFmt w:val="bullet"/>
+      <w:lvlText w:val="·"/>
       <w:lvlJc w:val="left"/>
     </w:lvl>
     <w:lvl w:ilvl="3">
@@ -1537,11 +1805,14 @@
   <w:num w:numId="7" w16cid:durableId="140463315">
     <w:abstractNumId w:val="2"/>
   </w:num>
+  <w:num w:numId="8" w16cid:durableId="1882472701">
+    <w:abstractNumId w:val="7"/>
+  </w:num>
 </w:numbering>
 </file>
 
 <file path=word/styles.xml><?xml version="1.0" encoding="utf-8"?>
-<w:styles xmlns:mc="http://schemas.openxmlformats.org/markup-compatibility/2006" xmlns:r="http://schemas.openxmlformats.org/officeDocument/2006/relationships" xmlns:w="http://schemas.openxmlformats.org/wordprocessingml/2006/main" xmlns:w14="http://schemas.microsoft.com/office/word/2010/wordml" xmlns:w15="http://schemas.microsoft.com/office/word/2012/wordml" xmlns:w16cex="http://schemas.microsoft.com/office/word/2018/wordml/cex" xmlns:w16cid="http://schemas.microsoft.com/office/word/2016/wordml/cid" xmlns:w16="http://schemas.microsoft.com/office/word/2018/wordml" xmlns:w16du="http://schemas.microsoft.com/office/word/2023/wordml/word16du" xmlns:w16sdtdh="http://schemas.microsoft.com/office/word/2020/wordml/sdtdatahash" xmlns:w16sdtfl="http://schemas.microsoft.com/office/word/2024/wordml/sdtformatlock" xmlns:w16se="http://schemas.microsoft.com/office/word/2015/wordml/symex" mc:Ignorable="w14 w15 w16se w16cid w16 w16cex w16sdtdh w16sdtfl w16du">
+<w:styles xmlns:mc="http://schemas.openxmlformats.org/markup-compatibility/2006" xmlns:r="http://schemas.openxmlformats.org/officeDocument/2006/relationships" xmlns:w="http://schemas.openxmlformats.org/wordprocessingml/2006/main" xmlns:w14="http://schemas.microsoft.com/office/word/2010/wordml" xmlns:w15="http://schemas.microsoft.com/office/word/2012/wordml" xmlns:w16cex="http://schemas.microsoft.com/office/word/2018/wordml/cex" xmlns:w16cid="http://schemas.microsoft.com/office/word/2016/wordml/cid" xmlns:w16="http://schemas.microsoft.com/office/word/2018/wordml" xmlns:w16sdtdh="http://schemas.microsoft.com/office/word/2020/wordml/sdtdatahash" xmlns:w16sdtfl="http://schemas.microsoft.com/office/word/2024/wordml/sdtformatlock" xmlns:w16se="http://schemas.microsoft.com/office/word/2015/wordml/symex" xmlns:w16du="http://schemas.microsoft.com/office/word/2023/wordml/word16du" mc:Ignorable="w14 w15 w16se w16cid w16 w16cex w16sdtdh w16sdtfl w16du">
   <w:docDefaults>
     <w:rPrDefault>
       <w:rPr>
@@ -1622,7 +1893,7 @@
     <w:lsdException w:name="Closing" w:semiHidden="1" w:unhideWhenUsed="1"/>
     <w:lsdException w:name="Signature" w:semiHidden="1" w:unhideWhenUsed="1"/>
     <w:lsdException w:name="Default Paragraph Font" w:semiHidden="1" w:uiPriority="1" w:unhideWhenUsed="1"/>
-    <w:lsdException w:name="Body Text" w:semiHidden="1" w:unhideWhenUsed="1"/>
+    <w:lsdException w:name="Body Text" w:semiHidden="1" w:uiPriority="0" w:unhideWhenUsed="1" w:qFormat="1"/>
     <w:lsdException w:name="Body Text Indent" w:semiHidden="1" w:unhideWhenUsed="1"/>
     <w:lsdException w:name="List Continue" w:semiHidden="1" w:unhideWhenUsed="1"/>
     <w:lsdException w:name="List Continue 2" w:semiHidden="1" w:unhideWhenUsed="1"/>
@@ -2471,6 +2742,28 @@
       <w14:ligatures w14:val="none"/>
     </w:rPr>
   </w:style>
+  <w:style w:type="paragraph" w:styleId="BodyText">
+    <w:name w:val="Body Text"/>
+    <w:basedOn w:val="Normal"/>
+    <w:link w:val="BodyTextChar"/>
+    <w:qFormat/>
+    <w:rsid w:val="00991497"/>
+    <w:pPr>
+      <w:spacing w:after="160" w:line="278" w:lineRule="auto"/>
+    </w:pPr>
+    <w:rPr>
+      <w:rFonts w:eastAsiaTheme="minorEastAsia"/>
+    </w:rPr>
+  </w:style>
+  <w:style w:type="character" w:customStyle="1" w:styleId="BodyTextChar">
+    <w:name w:val="Body Text Char"/>
+    <w:basedOn w:val="DefaultParagraphFont"/>
+    <w:link w:val="BodyText"/>
+    <w:rsid w:val="00991497"/>
+    <w:rPr>
+      <w:rFonts w:eastAsiaTheme="minorEastAsia"/>
+    </w:rPr>
+  </w:style>
 </w:styles>
 </file>
 

</xml_diff>

<commit_message>
test(docx): end-to-end numFmt markers and avoid double level lookup
Address review on the numFmt list-marker fix: resolve each placeholder
level's format once before re.sub, cover plain-suffix lowerLetter (a))
through convert(), and add a matching example to docx_lists.

Signed-off-by: Yuzhong Zhang <BetterAndBetterII@users.noreply.github.com>
</commit_message>
<xml_diff>
--- a/tests/data/docx/sources/docx_lists.docx
+++ b/tests/data/docx/sources/docx_lists.docx
@@ -1052,6 +1052,62 @@
       </w:r>
     </w:p>
     <w:p/>
+    <w:p>
+      <w:pPr>
+        <w:pStyle w:val="Heading4"/>
+      </w:pPr>
+      <w:r>
+        <w:t>Test 10: Non-decimal lvlText suffix</w:t>
+      </w:r>
+    </w:p>
+    <w:p>
+      <w:pPr>
+        <w:pStyle w:val="ListParagraph"/>
+        <w:numPr>
+          <w:ilvl w:val="0"/>
+          <w:numId w:val="9101"/>
+        </w:numPr>
+      </w:pPr>
+      <w:r>
+        <w:t>Parent decimal item</w:t>
+      </w:r>
+    </w:p>
+    <w:p>
+      <w:pPr>
+        <w:pStyle w:val="ListParagraph"/>
+        <w:numPr>
+          <w:ilvl w:val="1"/>
+          <w:numId w:val="9101"/>
+        </w:numPr>
+      </w:pPr>
+      <w:r>
+        <w:t>Child lettered first</w:t>
+      </w:r>
+    </w:p>
+    <w:p>
+      <w:pPr>
+        <w:pStyle w:val="ListParagraph"/>
+        <w:numPr>
+          <w:ilvl w:val="1"/>
+          <w:numId w:val="9101"/>
+        </w:numPr>
+      </w:pPr>
+      <w:r>
+        <w:t>Child lettered second</w:t>
+      </w:r>
+    </w:p>
+    <w:p>
+      <w:pPr>
+        <w:pStyle w:val="ListParagraph"/>
+        <w:numPr>
+          <w:ilvl w:val="0"/>
+          <w:numId w:val="9101"/>
+        </w:numPr>
+      </w:pPr>
+      <w:r>
+        <w:t>Parent decimal two</w:t>
+      </w:r>
+    </w:p>
     <w:sectPr>
       <w:pgSz w:w="12240" w:h="15840"/>
       <w:pgMar w:top="1440" w:right="1440" w:bottom="1440" w:left="1440" w:header="720" w:footer="720" w:gutter="0"/>
@@ -1807,6 +1863,21 @@
   </w:num>
   <w:num w:numId="8" w16cid:durableId="1882472701">
     <w:abstractNumId w:val="7"/>
+  </w:num>
+  <w:abstractNum w:abstractNumId="9100">
+    <w:lvl w:ilvl="0">
+      <w:start w:val="1"/>
+      <w:numFmt w:val="decimal"/>
+      <w:lvlText w:val="%1."/>
+    </w:lvl>
+    <w:lvl w:ilvl="1">
+      <w:start w:val="1"/>
+      <w:numFmt w:val="lowerLetter"/>
+      <w:lvlText w:val="%2)"/>
+    </w:lvl>
+  </w:abstractNum>
+  <w:num w:numId="9101">
+    <w:abstractNumId w:val="9100"/>
   </w:num>
 </w:numbering>
 </file>

</xml_diff>

<commit_message>
fix(ocr): align tessdata path fix with current main
Signed-off-by: Lanre Shittu <136805224+Shizoqua@users.noreply.github.com>
</commit_message>
<xml_diff>
--- a/tests/data/docx/sources/docx_lists.docx
+++ b/tests/data/docx/sources/docx_lists.docx
@@ -1052,6 +1052,62 @@
       </w:r>
     </w:p>
     <w:p/>
+    <w:p>
+      <w:pPr>
+        <w:pStyle w:val="Heading4"/>
+      </w:pPr>
+      <w:r>
+        <w:t>Test 10: Non-decimal lvlText suffix</w:t>
+      </w:r>
+    </w:p>
+    <w:p>
+      <w:pPr>
+        <w:pStyle w:val="ListParagraph"/>
+        <w:numPr>
+          <w:ilvl w:val="0"/>
+          <w:numId w:val="9101"/>
+        </w:numPr>
+      </w:pPr>
+      <w:r>
+        <w:t>Parent decimal item</w:t>
+      </w:r>
+    </w:p>
+    <w:p>
+      <w:pPr>
+        <w:pStyle w:val="ListParagraph"/>
+        <w:numPr>
+          <w:ilvl w:val="1"/>
+          <w:numId w:val="9101"/>
+        </w:numPr>
+      </w:pPr>
+      <w:r>
+        <w:t>Child lettered first</w:t>
+      </w:r>
+    </w:p>
+    <w:p>
+      <w:pPr>
+        <w:pStyle w:val="ListParagraph"/>
+        <w:numPr>
+          <w:ilvl w:val="1"/>
+          <w:numId w:val="9101"/>
+        </w:numPr>
+      </w:pPr>
+      <w:r>
+        <w:t>Child lettered second</w:t>
+      </w:r>
+    </w:p>
+    <w:p>
+      <w:pPr>
+        <w:pStyle w:val="ListParagraph"/>
+        <w:numPr>
+          <w:ilvl w:val="0"/>
+          <w:numId w:val="9101"/>
+        </w:numPr>
+      </w:pPr>
+      <w:r>
+        <w:t>Parent decimal two</w:t>
+      </w:r>
+    </w:p>
     <w:sectPr>
       <w:pgSz w:w="12240" w:h="15840"/>
       <w:pgMar w:top="1440" w:right="1440" w:bottom="1440" w:left="1440" w:header="720" w:footer="720" w:gutter="0"/>
@@ -1807,6 +1863,21 @@
   </w:num>
   <w:num w:numId="8" w16cid:durableId="1882472701">
     <w:abstractNumId w:val="7"/>
+  </w:num>
+  <w:abstractNum w:abstractNumId="9100">
+    <w:lvl w:ilvl="0">
+      <w:start w:val="1"/>
+      <w:numFmt w:val="decimal"/>
+      <w:lvlText w:val="%1."/>
+    </w:lvl>
+    <w:lvl w:ilvl="1">
+      <w:start w:val="1"/>
+      <w:numFmt w:val="lowerLetter"/>
+      <w:lvlText w:val="%2)"/>
+    </w:lvl>
+  </w:abstractNum>
+  <w:num w:numId="9101">
+    <w:abstractNumId w:val="9100"/>
   </w:num>
 </w:numbering>
 </file>

</xml_diff>

<commit_message>
refactor(docx): fold #4185 list scenarios into docx_lists fixture
Consolidate the two #4185 list-starting-level scenarios into the existing
docx_lists.docx fixture (page-break separated, each with a short heading)
instead of shipping standalone .docx files, and move the regression tests
into test_backend_msword_lists.py where the rest of the list behavior lives.
Delete the now-redundant standalone fixtures and test file.

Keeps list edge cases together in one place so the suite stays navigable.

Signed-off-by: Om Patil <ompatil1906@users.noreply.github.com>
</commit_message>
<xml_diff>
--- a/tests/data/docx/sources/docx_lists.docx
+++ b/tests/data/docx/sources/docx_lists.docx
@@ -1106,6 +1106,116 @@
       </w:pPr>
       <w:r>
         <w:t>Parent decimal two</w:t>
+      </w:r>
+    </w:p>
+    <w:p>
+      <w:r>
+        <w:br w:type="page"/>
+      </w:r>
+    </w:p>
+    <w:p>
+      <w:pPr>
+        <w:pStyle w:val="Heading3"/>
+      </w:pPr>
+      <w:r>
+        <w:t>List starting above indent level 0</w:t>
+      </w:r>
+    </w:p>
+    <w:p>
+      <w:pPr>
+        <w:pStyle w:val="ListParagraph"/>
+        <w:numPr>
+          <w:ilvl w:val="1"/>
+          <w:numId w:val="9201"/>
+        </w:numPr>
+      </w:pPr>
+      <w:r>
+        <w:t>Item A</w:t>
+      </w:r>
+    </w:p>
+    <w:p>
+      <w:pPr>
+        <w:pStyle w:val="ListParagraph"/>
+        <w:numPr>
+          <w:ilvl w:val="2"/>
+          <w:numId w:val="9201"/>
+        </w:numPr>
+      </w:pPr>
+      <w:r>
+        <w:t>Item B</w:t>
+      </w:r>
+    </w:p>
+    <w:p>
+      <w:pPr>
+        <w:pStyle w:val="ListParagraph"/>
+        <w:numPr>
+          <w:ilvl w:val="1"/>
+          <w:numId w:val="9201"/>
+        </w:numPr>
+      </w:pPr>
+      <w:r>
+        <w:t>Item C</w:t>
+      </w:r>
+    </w:p>
+    <w:p>
+      <w:r>
+        <w:br w:type="page"/>
+      </w:r>
+    </w:p>
+    <w:p>
+      <w:pPr>
+        <w:pStyle w:val="Heading3"/>
+      </w:pPr>
+      <w:r>
+        <w:t>List starting at indent level 0</w:t>
+      </w:r>
+    </w:p>
+    <w:p>
+      <w:pPr>
+        <w:pStyle w:val="ListParagraph"/>
+        <w:numPr>
+          <w:ilvl w:val="0"/>
+          <w:numId w:val="9301"/>
+        </w:numPr>
+      </w:pPr>
+      <w:r>
+        <w:t>Item A</w:t>
+      </w:r>
+    </w:p>
+    <w:p>
+      <w:pPr>
+        <w:pStyle w:val="ListParagraph"/>
+        <w:numPr>
+          <w:ilvl w:val="1"/>
+          <w:numId w:val="9301"/>
+        </w:numPr>
+      </w:pPr>
+      <w:r>
+        <w:t>Item B</w:t>
+      </w:r>
+    </w:p>
+    <w:p>
+      <w:pPr>
+        <w:pStyle w:val="ListParagraph"/>
+        <w:numPr>
+          <w:ilvl w:val="2"/>
+          <w:numId w:val="9301"/>
+        </w:numPr>
+      </w:pPr>
+      <w:r>
+        <w:t>Item C</w:t>
+      </w:r>
+    </w:p>
+    <w:p>
+      <w:pPr>
+        <w:pStyle w:val="ListParagraph"/>
+        <w:numPr>
+          <w:ilvl w:val="1"/>
+          <w:numId w:val="9301"/>
+        </w:numPr>
+      </w:pPr>
+      <w:r>
+        <w:t>Item D</w:t>
       </w:r>
     </w:p>
     <w:sectPr>
@@ -1878,6 +1988,46 @@
   </w:abstractNum>
   <w:num w:numId="9101">
     <w:abstractNumId w:val="9100"/>
+  </w:num>
+  <w:abstractNum w:abstractNumId="9200">
+    <w:lvl w:ilvl="0">
+      <w:start w:val="1"/>
+      <w:numFmt w:val="decimal"/>
+      <w:lvlText w:val="%1"/>
+    </w:lvl>
+    <w:lvl w:ilvl="1">
+      <w:start w:val="1"/>
+      <w:numFmt w:val="decimal"/>
+      <w:lvlText w:val="%1.%2"/>
+    </w:lvl>
+    <w:lvl w:ilvl="2">
+      <w:start w:val="1"/>
+      <w:numFmt w:val="decimal"/>
+      <w:lvlText w:val="%1.%2.%3"/>
+    </w:lvl>
+  </w:abstractNum>
+  <w:num w:numId="9201">
+    <w:abstractNumId w:val="9200"/>
+  </w:num>
+  <w:abstractNum w:abstractNumId="9300">
+    <w:lvl w:ilvl="0">
+      <w:start w:val="1"/>
+      <w:numFmt w:val="decimal"/>
+      <w:lvlText w:val="%1"/>
+    </w:lvl>
+    <w:lvl w:ilvl="1">
+      <w:start w:val="1"/>
+      <w:numFmt w:val="decimal"/>
+      <w:lvlText w:val="%1.%2"/>
+    </w:lvl>
+    <w:lvl w:ilvl="2">
+      <w:start w:val="1"/>
+      <w:numFmt w:val="decimal"/>
+      <w:lvlText w:val="%1.%2.%3"/>
+    </w:lvl>
+  </w:abstractNum>
+  <w:num w:numId="9301">
+    <w:abstractNumId w:val="9300"/>
   </w:num>
 </w:numbering>
 </file>

</xml_diff>